<commit_message>
other fix on latest cv
space up top & spelling below
</commit_message>
<xml_diff>
--- a/Michael_Bobak.docx
+++ b/Michael_Bobak.docx
@@ -47,7 +47,7 @@
           <w:sz w:val="20"/>
           <w:szCs w:val="20"/>
         </w:rPr>
-        <w:t>Ontology / Knowledge Engineer / Research Programmer / Analyst</w:t>
+        <w:t>Ontology / Knowledge Engineer  /  Research Programmer / Analyst</w:t>
       </w:r>
     </w:p>
     <w:p>
@@ -3749,7 +3749,7 @@
           <w:sz w:val="20"/>
           <w:szCs w:val="20"/>
         </w:rPr>
-        <w:t>cliniical</w:t>
+        <w:t>clinical</w:t>
       </w:r>
       <w:r>
         <w:rPr>
@@ -5606,11 +5606,8 @@
           <w:tab w:val="right" w:pos="10800" w:leader="none"/>
         </w:tabs>
         <w:spacing w:lineRule="auto" w:line="240" w:before="0" w:after="0"/>
-        <w:jc w:val="both"/>
-        <w:rPr>
-          <w:sz w:val="16"/>
-          <w:szCs w:val="16"/>
-        </w:rPr>
+        <w:jc w:val="left"/>
+        <w:rPr/>
       </w:pPr>
       <w:hyperlink r:id="rId30" w:tgtFrame="_blank">
         <w:r>
@@ -5701,7 +5698,7 @@
           <w:tab w:val="right" w:pos="10800" w:leader="none"/>
         </w:tabs>
         <w:spacing w:lineRule="auto" w:line="240" w:before="0" w:after="0"/>
-        <w:jc w:val="both"/>
+        <w:jc w:val="left"/>
         <w:rPr/>
       </w:pPr>
       <w:r>
@@ -5763,7 +5760,7 @@
           <w:tab w:val="right" w:pos="10800" w:leader="none"/>
         </w:tabs>
         <w:spacing w:lineRule="auto" w:line="240" w:before="0" w:after="0"/>
-        <w:jc w:val="both"/>
+        <w:jc w:val="left"/>
         <w:rPr/>
       </w:pPr>
       <w:r>
@@ -5920,7 +5917,7 @@
           <w:tab w:val="right" w:pos="10800" w:leader="none"/>
         </w:tabs>
         <w:spacing w:lineRule="auto" w:line="240" w:before="0" w:after="0"/>
-        <w:jc w:val="both"/>
+        <w:jc w:val="left"/>
         <w:rPr/>
       </w:pPr>
       <w:r>
@@ -5995,11 +5992,8 @@
           <w:tab w:val="right" w:pos="10800" w:leader="none"/>
         </w:tabs>
         <w:spacing w:lineRule="auto" w:line="240" w:before="0" w:after="0"/>
-        <w:jc w:val="both"/>
-        <w:rPr>
-          <w:sz w:val="16"/>
-          <w:szCs w:val="16"/>
-        </w:rPr>
+        <w:jc w:val="left"/>
+        <w:rPr/>
       </w:pPr>
       <w:r>
         <w:rPr>
@@ -6028,11 +6022,8 @@
           <w:tab w:val="right" w:pos="10800" w:leader="none"/>
         </w:tabs>
         <w:spacing w:lineRule="auto" w:line="240" w:before="0" w:after="0"/>
-        <w:jc w:val="both"/>
-        <w:rPr>
-          <w:sz w:val="16"/>
-          <w:szCs w:val="16"/>
-        </w:rPr>
+        <w:jc w:val="left"/>
+        <w:rPr/>
       </w:pPr>
       <w:r>
         <w:rPr>
@@ -6061,11 +6052,8 @@
           <w:tab w:val="right" w:pos="10800" w:leader="none"/>
         </w:tabs>
         <w:spacing w:lineRule="auto" w:line="240" w:before="0" w:after="0"/>
-        <w:jc w:val="both"/>
-        <w:rPr>
-          <w:sz w:val="16"/>
-          <w:szCs w:val="16"/>
-        </w:rPr>
+        <w:jc w:val="left"/>
+        <w:rPr/>
       </w:pPr>
       <w:r>
         <w:rPr>
@@ -6094,11 +6082,8 @@
           <w:tab w:val="right" w:pos="10800" w:leader="none"/>
         </w:tabs>
         <w:spacing w:lineRule="auto" w:line="240" w:before="0" w:after="0"/>
-        <w:jc w:val="both"/>
-        <w:rPr>
-          <w:sz w:val="16"/>
-          <w:szCs w:val="16"/>
-        </w:rPr>
+        <w:jc w:val="left"/>
+        <w:rPr/>
       </w:pPr>
       <w:r>
         <w:rPr>

</xml_diff>